<commit_message>
Release SAFE V7 after security audit
</commit_message>
<xml_diff>
--- a/Пояснительная_записка_перенос_PST_Outlook.docx
+++ b/Пояснительная_записка_перенос_PST_Outlook.docx
@@ -8,7 +8,9 @@
       </w:pPr>
       <w:r>
         <w:rPr>
+          <w:rFonts w:ascii="Calibri" w:hAnsi="Calibri"/>
           <w:b/>
+          <w:color w:val="000000"/>
           <w:sz w:val="46"/>
         </w:rPr>
         <w:t>ПОЯСНИТЕЛЬНАЯ ЗАПИСКА</w:t>
@@ -20,651 +22,692 @@
       </w:pPr>
       <w:r>
         <w:rPr>
-          <w:color w:val="5A5A5A"/>
+          <w:rFonts w:ascii="Calibri" w:hAnsi="Calibri"/>
+          <w:color w:val="5A626C"/>
           <w:sz w:val="28"/>
         </w:rPr>
-        <w:t>к комплекту PowerShell-скриптов массового переноса архивов Microsoft Outlook</w:t>
+        <w:t>к безопасному комплекту автоматизированного копирования и переподключения PST</w:t>
       </w:r>
     </w:p>
-    <w:p>
-      <w:pPr>
-        <w:spacing w:after="40"/>
-      </w:pPr>
-      <w:r>
-        <w:rPr>
-          <w:b/>
-        </w:rPr>
-        <w:t xml:space="preserve">Наименование: </w:t>
-      </w:r>
-      <w:r>
-        <w:t>Outlook PST Migration</w:t>
-      </w:r>
-    </w:p>
-    <w:p>
-      <w:pPr>
-        <w:spacing w:after="40"/>
-      </w:pPr>
-      <w:r>
-        <w:rPr>
-          <w:b/>
-        </w:rPr>
-        <w:t xml:space="preserve">Назначение: </w:t>
-      </w:r>
-      <w:r>
-        <w:t>Автоматизированный перенос локальных архивов Outlook (*.pst)</w:t>
-      </w:r>
-    </w:p>
-    <w:p>
-      <w:pPr>
-        <w:spacing w:after="40"/>
-      </w:pPr>
-      <w:r>
-        <w:rPr>
-          <w:b/>
-        </w:rPr>
-        <w:t xml:space="preserve">Среда выполнения: </w:t>
-      </w:r>
-      <w:r>
-        <w:t>Windows, Windows PowerShell 5.1, классический Microsoft Outlook</w:t>
-      </w:r>
-    </w:p>
-    <w:p>
-      <w:pPr>
-        <w:spacing w:after="40"/>
-      </w:pPr>
-      <w:r>
-        <w:rPr>
-          <w:b/>
-        </w:rPr>
-        <w:t xml:space="preserve">Состав комплекта: </w:t>
-      </w:r>
-      <w:r>
-        <w:t>1-SystemStage.ps1, 2-UserStage.ps1, README.txt</w:t>
-      </w:r>
-    </w:p>
-    <w:p>
-      <w:pPr>
-        <w:spacing w:after="40"/>
-      </w:pPr>
-      <w:r>
-        <w:rPr>
-          <w:b/>
-        </w:rPr>
-        <w:t xml:space="preserve">Статус: </w:t>
-      </w:r>
-      <w:r>
-        <w:t>Для пилотного тестирования перед массовым развёртыванием</w:t>
-      </w:r>
-    </w:p>
-    <w:p>
-      <w:pPr>
-        <w:spacing w:before="240"/>
-        <w:pBdr>
-          <w:bottom w:val="single" w:sz="8" w:color="2E74B5"/>
-        </w:pBdr>
-      </w:pPr>
-    </w:p>
+    <w:tbl>
+      <w:tblPr>
+        <w:tblW w:type="auto" w:w="0"/>
+        <w:jc w:val="left"/>
+        <w:tblLayout w:type="fixed"/>
+        <w:tblLook w:firstColumn="1" w:firstRow="1" w:lastColumn="0" w:lastRow="0" w:noHBand="0" w:noVBand="1" w:val="04A0"/>
+      </w:tblPr>
+      <w:tblGrid>
+        <w:gridCol w:w="2700"/>
+        <w:gridCol w:w="6660"/>
+      </w:tblGrid>
+      <w:tr>
+        <w:tc>
+          <w:tcPr>
+            <w:tcW w:type="dxa" w:w="2700"/>
+            <w:vAlign w:val="center"/>
+            <w:tcMar>
+              <w:top w:w="80" w:type="dxa"/>
+              <w:bottom w:w="80" w:type="dxa"/>
+              <w:start w:w="120" w:type="dxa"/>
+              <w:end w:w="120" w:type="dxa"/>
+            </w:tcMar>
+          </w:tcPr>
+          <w:p>
+            <w:r>
+              <w:rPr>
+                <w:rFonts w:ascii="Calibri" w:hAnsi="Calibri"/>
+                <w:b/>
+                <w:sz w:val="21"/>
+              </w:rPr>
+              <w:t>Наименование</w:t>
+            </w:r>
+          </w:p>
+        </w:tc>
+        <w:tc>
+          <w:tcPr>
+            <w:tcW w:type="dxa" w:w="6660"/>
+            <w:vAlign w:val="center"/>
+            <w:tcMar>
+              <w:top w:w="80" w:type="dxa"/>
+              <w:bottom w:w="80" w:type="dxa"/>
+              <w:start w:w="120" w:type="dxa"/>
+              <w:end w:w="120" w:type="dxa"/>
+            </w:tcMar>
+          </w:tcPr>
+          <w:p>
+            <w:r>
+              <w:rPr>
+                <w:rFonts w:ascii="Calibri" w:hAnsi="Calibri"/>
+                <w:sz w:val="21"/>
+              </w:rPr>
+              <w:t>Outlook PST Migration SAFE V7</w:t>
+            </w:r>
+          </w:p>
+        </w:tc>
+      </w:tr>
+      <w:tr>
+        <w:tc>
+          <w:tcPr>
+            <w:tcW w:type="dxa" w:w="2700"/>
+            <w:vAlign w:val="center"/>
+            <w:tcMar>
+              <w:top w:w="80" w:type="dxa"/>
+              <w:bottom w:w="80" w:type="dxa"/>
+              <w:start w:w="120" w:type="dxa"/>
+              <w:end w:w="120" w:type="dxa"/>
+            </w:tcMar>
+          </w:tcPr>
+          <w:p>
+            <w:r>
+              <w:rPr>
+                <w:rFonts w:ascii="Calibri" w:hAnsi="Calibri"/>
+                <w:b/>
+                <w:sz w:val="21"/>
+              </w:rPr>
+              <w:t>Назначение</w:t>
+            </w:r>
+          </w:p>
+        </w:tc>
+        <w:tc>
+          <w:tcPr>
+            <w:tcW w:type="dxa" w:w="6660"/>
+            <w:vAlign w:val="center"/>
+            <w:tcMar>
+              <w:top w:w="80" w:type="dxa"/>
+              <w:bottom w:w="80" w:type="dxa"/>
+              <w:start w:w="120" w:type="dxa"/>
+              <w:end w:w="120" w:type="dxa"/>
+            </w:tcMar>
+          </w:tcPr>
+          <w:p>
+            <w:r>
+              <w:rPr>
+                <w:rFonts w:ascii="Calibri" w:hAnsi="Calibri"/>
+                <w:sz w:val="21"/>
+              </w:rPr>
+              <w:t>Безопасное копирование локальных архивов Outlook (*.pst)</w:t>
+            </w:r>
+          </w:p>
+        </w:tc>
+      </w:tr>
+      <w:tr>
+        <w:tc>
+          <w:tcPr>
+            <w:tcW w:type="dxa" w:w="2700"/>
+            <w:vAlign w:val="center"/>
+            <w:tcMar>
+              <w:top w:w="80" w:type="dxa"/>
+              <w:bottom w:w="80" w:type="dxa"/>
+              <w:start w:w="120" w:type="dxa"/>
+              <w:end w:w="120" w:type="dxa"/>
+            </w:tcMar>
+          </w:tcPr>
+          <w:p>
+            <w:r>
+              <w:rPr>
+                <w:rFonts w:ascii="Calibri" w:hAnsi="Calibri"/>
+                <w:b/>
+                <w:sz w:val="21"/>
+              </w:rPr>
+              <w:t>Среда</w:t>
+            </w:r>
+          </w:p>
+        </w:tc>
+        <w:tc>
+          <w:tcPr>
+            <w:tcW w:type="dxa" w:w="6660"/>
+            <w:vAlign w:val="center"/>
+            <w:tcMar>
+              <w:top w:w="80" w:type="dxa"/>
+              <w:bottom w:w="80" w:type="dxa"/>
+              <w:start w:w="120" w:type="dxa"/>
+              <w:end w:w="120" w:type="dxa"/>
+            </w:tcMar>
+          </w:tcPr>
+          <w:p>
+            <w:r>
+              <w:rPr>
+                <w:rFonts w:ascii="Calibri" w:hAnsi="Calibri"/>
+                <w:sz w:val="21"/>
+              </w:rPr>
+              <w:t>Windows 10/11, Windows PowerShell 5.1, классический Outlook</w:t>
+            </w:r>
+          </w:p>
+        </w:tc>
+      </w:tr>
+      <w:tr>
+        <w:tc>
+          <w:tcPr>
+            <w:tcW w:type="dxa" w:w="2700"/>
+            <w:vAlign w:val="center"/>
+            <w:tcMar>
+              <w:top w:w="80" w:type="dxa"/>
+              <w:bottom w:w="80" w:type="dxa"/>
+              <w:start w:w="120" w:type="dxa"/>
+              <w:end w:w="120" w:type="dxa"/>
+            </w:tcMar>
+          </w:tcPr>
+          <w:p>
+            <w:r>
+              <w:rPr>
+                <w:rFonts w:ascii="Calibri" w:hAnsi="Calibri"/>
+                <w:b/>
+                <w:sz w:val="21"/>
+              </w:rPr>
+              <w:t>Режим</w:t>
+            </w:r>
+          </w:p>
+        </w:tc>
+        <w:tc>
+          <w:tcPr>
+            <w:tcW w:type="dxa" w:w="6660"/>
+            <w:vAlign w:val="center"/>
+            <w:tcMar>
+              <w:top w:w="80" w:type="dxa"/>
+              <w:bottom w:w="80" w:type="dxa"/>
+              <w:start w:w="120" w:type="dxa"/>
+              <w:end w:w="120" w:type="dxa"/>
+            </w:tcMar>
+          </w:tcPr>
+          <w:p>
+            <w:r>
+              <w:rPr>
+                <w:rFonts w:ascii="Calibri" w:hAnsi="Calibri"/>
+                <w:sz w:val="21"/>
+              </w:rPr>
+              <w:t>Исходные PST не удаляются</w:t>
+            </w:r>
+          </w:p>
+        </w:tc>
+      </w:tr>
+      <w:tr>
+        <w:tc>
+          <w:tcPr>
+            <w:tcW w:type="dxa" w:w="2700"/>
+            <w:vAlign w:val="center"/>
+            <w:tcMar>
+              <w:top w:w="80" w:type="dxa"/>
+              <w:bottom w:w="80" w:type="dxa"/>
+              <w:start w:w="120" w:type="dxa"/>
+              <w:end w:w="120" w:type="dxa"/>
+            </w:tcMar>
+          </w:tcPr>
+          <w:p>
+            <w:r>
+              <w:rPr>
+                <w:rFonts w:ascii="Calibri" w:hAnsi="Calibri"/>
+                <w:b/>
+                <w:sz w:val="21"/>
+              </w:rPr>
+              <w:t>Статус</w:t>
+            </w:r>
+          </w:p>
+        </w:tc>
+        <w:tc>
+          <w:tcPr>
+            <w:tcW w:type="dxa" w:w="6660"/>
+            <w:vAlign w:val="center"/>
+            <w:tcMar>
+              <w:top w:w="80" w:type="dxa"/>
+              <w:bottom w:w="80" w:type="dxa"/>
+              <w:start w:w="120" w:type="dxa"/>
+              <w:end w:w="120" w:type="dxa"/>
+            </w:tcMar>
+          </w:tcPr>
+          <w:p>
+            <w:r>
+              <w:rPr>
+                <w:rFonts w:ascii="Calibri" w:hAnsi="Calibri"/>
+                <w:sz w:val="21"/>
+              </w:rPr>
+              <w:t>Для пилотного тестирования перед массовым развёртыванием</w:t>
+            </w:r>
+          </w:p>
+        </w:tc>
+      </w:tr>
+    </w:tbl>
     <w:p>
       <w:pPr>
         <w:pStyle w:val="Heading1"/>
-        <w:keepNext/>
       </w:pPr>
       <w:r>
-        <w:t>1. Цель разработки</w:t>
+        <w:t>1. Назначение</w:t>
       </w:r>
     </w:p>
     <w:p>
       <w:r>
-        <w:t>Комплект предназначен для централизованного переноса локальных файлов архивов Microsoft Outlook формата PST из профиля сотрудника в заданную папку на другом локальном диске. Решение сокращает ручные действия специалиста и снижает вероятность выбора неверного пользовательского профиля.</w:t>
-      </w:r>
-    </w:p>
-    <w:p>
-      <w:r>
-        <w:t>Файлы OST не обрабатываются, поскольку они являются локальным кэшем почтового ящика и при необходимости создаются Outlook повторно.</w:t>
+        <w:t>Комплект предназначен для централизованного поиска, безопасного копирования и переподключения локальных PST-архивов текущего пользователя. Файлы OST и другие пользовательские документы не обрабатываются.</w:t>
       </w:r>
     </w:p>
     <w:p>
       <w:pPr>
         <w:pStyle w:val="Heading1"/>
-        <w:keepNext/>
       </w:pPr>
       <w:r>
         <w:t>2. Принцип работы</w:t>
       </w:r>
     </w:p>
     <w:p>
-      <w:r>
-        <w:t>Решение разделено на два этапа из-за разграничения системного и пользовательского контекстов Windows.</w:t>
-      </w:r>
-    </w:p>
-    <w:p>
       <w:pPr>
         <w:pStyle w:val="ListNumber"/>
-        <w:spacing w:after="120" w:line="264" w:lineRule="auto"/>
-        <w:ind w:left="720" w:hanging="360"/>
         <w:numPr>
           <w:ilvl w:val="0"/>
           <w:numId w:val="10"/>
         </w:numPr>
       </w:pPr>
       <w:r>
-        <w:t>Первый скрипт запускается с административными правами или от имени SYSTEM, определяет интерактивного пользователя и создаёт для него временное задание.</w:t>
+        <w:t>BAT-файл проверяет комплект и запускает системный этап с административными правами.</w:t>
       </w:r>
     </w:p>
     <w:p>
       <w:pPr>
         <w:pStyle w:val="ListNumber"/>
-        <w:spacing w:after="120" w:line="264" w:lineRule="auto"/>
-        <w:ind w:left="720" w:hanging="360"/>
         <w:numPr>
           <w:ilvl w:val="0"/>
           <w:numId w:val="10"/>
         </w:numPr>
       </w:pPr>
       <w:r>
-        <w:t>Второй скрипт запускается в пользовательском сеансе и получает список всех подключённых к Outlook PST независимо от расположения.</w:t>
+        <w:t>Системный этап определяет активного пользователя и запускает пользовательский этап в его интерактивном сеансе.</w:t>
       </w:r>
     </w:p>
     <w:p>
       <w:pPr>
         <w:pStyle w:val="ListNumber"/>
-        <w:spacing w:after="120" w:line="264" w:lineRule="auto"/>
-        <w:ind w:left="720" w:hanging="360"/>
         <w:numPr>
           <w:ilvl w:val="0"/>
           <w:numId w:val="10"/>
         </w:numPr>
       </w:pPr>
       <w:r>
-        <w:t>Дополнительно выполняется поиск неподключённых PST внутри профиля сотрудника. Такой подход не затрагивает архивы других пользователей.</w:t>
+        <w:t>Проверяются классический Outlook, профиль пользователя, целевая папка, размер PST и свободное место.</w:t>
       </w:r>
     </w:p>
     <w:p>
       <w:pPr>
         <w:pStyle w:val="ListNumber"/>
-        <w:spacing w:after="120" w:line="264" w:lineRule="auto"/>
-        <w:ind w:left="720" w:hanging="360"/>
         <w:numPr>
           <w:ilvl w:val="0"/>
           <w:numId w:val="10"/>
         </w:numPr>
       </w:pPr>
       <w:r>
-        <w:t>Outlook закрывается, после чего все найденные архивы копируются в заданную папку и проверяются по SHA-256.</w:t>
+        <w:t>Подключённые PST обнаруживаются через Outlook COM; неподключённые PST дополнительно ищутся внутри профиля пользователя.</w:t>
       </w:r>
     </w:p>
     <w:p>
       <w:pPr>
         <w:pStyle w:val="ListNumber"/>
-        <w:spacing w:after="120" w:line="264" w:lineRule="auto"/>
-        <w:ind w:left="720" w:hanging="360"/>
         <w:numPr>
           <w:ilvl w:val="0"/>
           <w:numId w:val="10"/>
         </w:numPr>
       </w:pPr>
       <w:r>
-        <w:t>Новые копии подключаются, старые пути отключаются, и только после общей проверки удаляются исходные файлы.</w:t>
+        <w:t>Outlook получает штатную команду закрытия. Принудительное завершение процесса не используется.</w:t>
       </w:r>
     </w:p>
     <w:p>
       <w:pPr>
         <w:pStyle w:val="ListNumber"/>
-        <w:spacing w:after="120" w:line="264" w:lineRule="auto"/>
-        <w:ind w:left="720" w:hanging="360"/>
         <w:numPr>
           <w:ilvl w:val="0"/>
           <w:numId w:val="10"/>
         </w:numPr>
       </w:pPr>
       <w:r>
-        <w:t>Второй этап записывает результат и журнал. Первый этап проверяет результат и удаляет временное задание Планировщика.</w:t>
+        <w:t>PST копируются во временные файлы .partial, затем исходник и копия проверяются по SHA-256.</w:t>
+      </w:r>
+    </w:p>
+    <w:p>
+      <w:pPr>
+        <w:pStyle w:val="ListNumber"/>
+        <w:numPr>
+          <w:ilvl w:val="0"/>
+          <w:numId w:val="10"/>
+        </w:numPr>
+      </w:pPr>
+      <w:r>
+        <w:t>Проверенные копии подключаются к классическому Outlook, а старые пути отключаются. Исходные файлы остаются на месте.</w:t>
       </w:r>
     </w:p>
     <w:p>
       <w:pPr>
         <w:pStyle w:val="Heading1"/>
-        <w:keepNext/>
       </w:pPr>
       <w:r>
-        <w:t>3. Причина разделения на два скрипта</w:t>
+        <w:t>3. Меры безопасности V7</w:t>
       </w:r>
     </w:p>
     <w:p>
+      <w:pPr>
+        <w:pStyle w:val="ListBullet"/>
+      </w:pPr>
       <w:r>
-        <w:t>Настройки Outlook относятся к профилю конкретного пользователя. Скрипт, запущенный от SYSTEM, не должен управлять хранилищами Outlook сотрудника. Поэтому системный этап только определяет пользователя, запускает задание и контролирует итог, а поиск, копирование и переподключение PST выполняются в интерактивном пользовательском сеансе.</w:t>
+        <w:t>Исходные PST никогда не удаляются автоматически.</w:t>
+      </w:r>
+    </w:p>
+    <w:p>
+      <w:pPr>
+        <w:pStyle w:val="ListBullet"/>
+      </w:pPr>
+      <w:r>
+        <w:t>При ошибке удаляются только незавершённые файлы .partial; проверенные копии сохраняются.</w:t>
+      </w:r>
+    </w:p>
+    <w:p>
+      <w:pPr>
+        <w:pStyle w:val="ListBullet"/>
+      </w:pPr>
+      <w:r>
+        <w:t>Перед закрытием Outlook проверяется свободное место, включая резерв 512 МБ.</w:t>
+      </w:r>
+    </w:p>
+    <w:p>
+      <w:pPr>
+        <w:pStyle w:val="ListBullet"/>
+      </w:pPr>
+      <w:r>
+        <w:t>Одновременные запуски блокируются эксклюзивными файловыми блокировками, устойчивыми к оставшимся lock-файлам.</w:t>
+      </w:r>
+    </w:p>
+    <w:p>
+      <w:pPr>
+        <w:pStyle w:val="ListBullet"/>
+      </w:pPr>
+      <w:r>
+        <w:t>result.json обновляется атомарной заменой, поэтому контроллер не читает частично записанный JSON.</w:t>
+      </w:r>
+    </w:p>
+    <w:p>
+      <w:pPr>
+        <w:pStyle w:val="ListBullet"/>
+      </w:pPr>
+      <w:r>
+        <w:t>При изменении профиля Outlook выполняется откат подключений.</w:t>
+      </w:r>
+    </w:p>
+    <w:p>
+      <w:pPr>
+        <w:pStyle w:val="ListBullet"/>
+      </w:pPr>
+      <w:r>
+        <w:t>Для каждого PST сохраняются исходный путь, новый путь и обе контрольные суммы SHA-256.</w:t>
       </w:r>
     </w:p>
     <w:p>
       <w:pPr>
         <w:pStyle w:val="Heading1"/>
-        <w:keepNext/>
       </w:pPr>
       <w:r>
-        <w:t>4. Реализованные меры безопасности</w:t>
+        <w:t>4. Выходные файлы</w:t>
+      </w:r>
+    </w:p>
+    <w:p>
+      <w:r>
+        <w:t>Для каждого пользователя создаётся папка:</w:t>
+      </w:r>
+    </w:p>
+    <w:p>
+      <w:r>
+        <w:rPr>
+          <w:rFonts w:ascii="Consolas" w:hAnsi="Consolas"/>
+          <w:sz w:val="20"/>
+        </w:rPr>
+        <w:t>C:\ProgramData\OutlookPstMigrationSafeV7\&lt;SID&gt;</w:t>
       </w:r>
     </w:p>
     <w:p>
       <w:pPr>
         <w:pStyle w:val="ListBullet"/>
-        <w:spacing w:after="120" w:line="264" w:lineRule="auto"/>
-        <w:ind w:left="720" w:hanging="360"/>
       </w:pPr>
       <w:r>
-        <w:t>При отсутствии вошедшего пользователя выполнение прекращается.</w:t>
+        <w:t>migration.log — подробный журнал этапов и ошибок;</w:t>
       </w:r>
     </w:p>
     <w:p>
       <w:pPr>
         <w:pStyle w:val="ListBullet"/>
-        <w:spacing w:after="120" w:line="264" w:lineRule="auto"/>
-        <w:ind w:left="720" w:hanging="360"/>
       </w:pPr>
       <w:r>
-        <w:t>Если одновременно обнаружено несколько разных интерактивных пользователей, выполнение прекращается.</w:t>
+        <w:t>result.json — состояние, количество PST, объём и пути журналов;</w:t>
       </w:r>
     </w:p>
     <w:p>
       <w:pPr>
         <w:pStyle w:val="ListBullet"/>
-        <w:spacing w:after="120" w:line="264" w:lineRule="auto"/>
-        <w:ind w:left="720" w:hanging="360"/>
       </w:pPr>
       <w:r>
-        <w:t>Перед удалением исходника новая копия проверяется по SHA-256 и подключается в Outlook.</w:t>
+        <w:t>manifest.csv — соответствие исходных и новых путей и SHA-256.</w:t>
+      </w:r>
+    </w:p>
+    <w:p>
+      <w:pPr>
+        <w:pStyle w:val="Heading1"/>
+      </w:pPr>
+      <w:r>
+        <w:t>5. Ограничения</w:t>
       </w:r>
     </w:p>
     <w:p>
       <w:pPr>
         <w:pStyle w:val="ListBullet"/>
-        <w:spacing w:after="120" w:line="264" w:lineRule="auto"/>
-        <w:ind w:left="720" w:hanging="360"/>
       </w:pPr>
       <w:r>
-        <w:t>При ошибке копирования или подключения исходный PST не удаляется.</w:t>
+        <w:t>Поддерживается только классический Outlook для Windows. Новый Outlook не предоставляет необходимую COM-автоматизацию.</w:t>
       </w:r>
     </w:p>
     <w:p>
       <w:pPr>
         <w:pStyle w:val="ListBullet"/>
-        <w:spacing w:after="120" w:line="264" w:lineRule="auto"/>
-        <w:ind w:left="720" w:hanging="360"/>
       </w:pPr>
       <w:r>
-        <w:t>При частичной ошибке созданные копии удаляются, а профиль Outlook возвращается в исходное состояние.</w:t>
+        <w:t>PST с паролем может потребовать интерактивного ввода. Поддерживаемого способа передать пароль через Outlook COM нет.</w:t>
       </w:r>
     </w:p>
     <w:p>
       <w:pPr>
         <w:pStyle w:val="ListBullet"/>
-        <w:spacing w:after="120" w:line="264" w:lineRule="auto"/>
-        <w:ind w:left="720" w:hanging="360"/>
       </w:pPr>
       <w:r>
-        <w:t>Повторное подключение уже подключённого PST не выполняется.</w:t>
+        <w:t>Если Outlook не закрылся штатно за 30 секунд, операция прекращается без принудительного завершения процесса.</w:t>
       </w:r>
     </w:p>
     <w:p>
       <w:pPr>
         <w:pStyle w:val="ListBullet"/>
-        <w:spacing w:after="120" w:line="264" w:lineRule="auto"/>
-        <w:ind w:left="720" w:hanging="360"/>
       </w:pPr>
       <w:r>
-        <w:t>Постоянное уникальное имя исключает дубликаты при повторном запуске.</w:t>
+        <w:t>Неподключённые PST вне профиля пользователя намеренно не ищутся, чтобы не захватить данные другого сотрудника.</w:t>
       </w:r>
     </w:p>
     <w:p>
       <w:pPr>
         <w:pStyle w:val="ListBullet"/>
-        <w:spacing w:after="120" w:line="264" w:lineRule="auto"/>
-        <w:ind w:left="720" w:hanging="360"/>
       </w:pPr>
       <w:r>
-        <w:t>Одновременный повторный запуск блокируется специальным lock-файлом.</w:t>
-      </w:r>
-    </w:p>
-    <w:p>
-      <w:pPr>
-        <w:pStyle w:val="ListBullet"/>
-        <w:spacing w:after="120" w:line="264" w:lineRule="auto"/>
-        <w:ind w:left="720" w:hanging="360"/>
-      </w:pPr>
-      <w:r>
-        <w:t>По каждому этапу ведётся журнал, а результат передаётся системному скрипту.</w:t>
-      </w:r>
-    </w:p>
-    <w:p>
-      <w:pPr>
-        <w:pStyle w:val="ListBullet"/>
-        <w:spacing w:after="120" w:line="264" w:lineRule="auto"/>
-        <w:ind w:left="720" w:hanging="360"/>
-      </w:pPr>
-      <w:r>
-        <w:t>После получения результата временное задание Планировщика удаляется.</w:t>
-      </w:r>
-    </w:p>
-    <w:p>
-      <w:pPr>
-        <w:pStyle w:val="ListBullet"/>
-        <w:spacing w:after="120" w:line="264" w:lineRule="auto"/>
-        <w:ind w:left="720" w:hanging="360"/>
-      </w:pPr>
-      <w:r>
-        <w:t>Права на новую папку выдаются только определённому пользователю.</w:t>
-      </w:r>
-    </w:p>
-    <w:p>
-      <w:pPr>
-        <w:pStyle w:val="ListBullet"/>
-        <w:spacing w:after="120" w:line="264" w:lineRule="auto"/>
-        <w:ind w:left="720" w:hanging="360"/>
-      </w:pPr>
-      <w:r>
-        <w:t>Файлы OST не изменяются.</w:t>
+        <w:t>ExecutionPolicy Bypass оставлен для запуска загруженного комплекта. Для промышленного внедрения рекомендуется подписать PS1 корпоративным сертификатом и применять правила WDAC/AppLocker.</w:t>
       </w:r>
     </w:p>
     <w:p>
       <w:pPr>
         <w:pStyle w:val="Heading1"/>
-        <w:keepNext/>
       </w:pPr>
       <w:r>
-        <w:t>5. Требования к рабочему месту</w:t>
-      </w:r>
-    </w:p>
-    <w:p>
-      <w:pPr>
-        <w:pStyle w:val="ListBullet"/>
-        <w:spacing w:after="120" w:line="264" w:lineRule="auto"/>
-        <w:ind w:left="720" w:hanging="360"/>
-      </w:pPr>
-      <w:r>
-        <w:t>Операционная система Windows с доступным модулем ScheduledTasks.</w:t>
-      </w:r>
-    </w:p>
-    <w:p>
-      <w:pPr>
-        <w:pStyle w:val="ListBullet"/>
-        <w:spacing w:after="120" w:line="264" w:lineRule="auto"/>
-        <w:ind w:left="720" w:hanging="360"/>
-      </w:pPr>
-      <w:r>
-        <w:t>Windows PowerShell 5.1.</w:t>
-      </w:r>
-    </w:p>
-    <w:p>
-      <w:pPr>
-        <w:pStyle w:val="ListBullet"/>
-        <w:spacing w:after="120" w:line="264" w:lineRule="auto"/>
-        <w:ind w:left="720" w:hanging="360"/>
-      </w:pPr>
-      <w:r>
-        <w:t>Установленный классический Microsoft Outlook с поддержкой COM-автоматизации.</w:t>
-      </w:r>
-    </w:p>
-    <w:p>
-      <w:pPr>
-        <w:pStyle w:val="ListBullet"/>
-        <w:spacing w:after="120" w:line="264" w:lineRule="auto"/>
-        <w:ind w:left="720" w:hanging="360"/>
-      </w:pPr>
-      <w:r>
-        <w:t>Наличие и достаточное свободное место на диске назначения.</w:t>
-      </w:r>
-    </w:p>
-    <w:p>
-      <w:pPr>
-        <w:pStyle w:val="ListBullet"/>
-        <w:spacing w:after="120" w:line="264" w:lineRule="auto"/>
-        <w:ind w:left="720" w:hanging="360"/>
-      </w:pPr>
-      <w:r>
-        <w:t>Оба PS1-файла размещены в C:\ProgramData\OutlookPstMigration.</w:t>
-      </w:r>
-    </w:p>
-    <w:p>
-      <w:pPr>
-        <w:pStyle w:val="ListBullet"/>
-        <w:spacing w:after="120" w:line="264" w:lineRule="auto"/>
-        <w:ind w:left="720" w:hanging="360"/>
-      </w:pPr>
-      <w:r>
-        <w:t>Первый этап запускается с административными правами или от SYSTEM.</w:t>
-      </w:r>
-    </w:p>
-    <w:p>
-      <w:pPr>
-        <w:pStyle w:val="Heading1"/>
-        <w:keepNext/>
-      </w:pPr>
-      <w:r>
-        <w:t>6. Ограничения и риски</w:t>
-      </w:r>
-    </w:p>
-    <w:p>
-      <w:r>
-        <w:t>Принудительное закрытие Outlook может привести к потере несохранённого черновика. Запуск рекомендуется выполнять в согласованное время либо после уведомления сотрудника.</w:t>
-      </w:r>
-    </w:p>
-    <w:p>
-      <w:r>
-        <w:t>Решение рассчитано на классический Outlook для Windows. Новый Outlook не предоставляет используемый COM-интерфейс и данным комплектом не поддерживается.</w:t>
-      </w:r>
-    </w:p>
-    <w:p>
-      <w:r>
-        <w:t>Если на компьютере открыты сеансы нескольких разных пользователей, автоматический выбор профиля намеренно не выполняется. Такой компьютер требует отдельной обработки.</w:t>
-      </w:r>
-    </w:p>
-    <w:p>
-      <w:r>
-        <w:t>Подключённые к Outlook PST обнаруживаются независимо от диска или папки. Неподключённые PST ищутся только внутри профиля пользователя, чтобы исключить перенос архивов других сотрудников. Серверный архив Exchange/Microsoft 365 не является PST и не обрабатывается.</w:t>
-      </w:r>
-    </w:p>
-    <w:p>
-      <w:r>
-        <w:t>Если PST защищён паролем, Outlook может запросить его интерактивно. Поддерживаемого способа автоматически передать пароль через Outlook COM API нет. При превышении установленного времени задача останавливается, а исходные файлы сохраняются.</w:t>
-      </w:r>
-    </w:p>
-    <w:p>
-      <w:pPr>
-        <w:pStyle w:val="Heading1"/>
-        <w:keepNext/>
-      </w:pPr>
-      <w:r>
-        <w:t>7. Рекомендуемый порядок внедрения</w:t>
+        <w:t>6. Порядок внедрения</w:t>
       </w:r>
     </w:p>
     <w:p>
       <w:pPr>
         <w:pStyle w:val="ListNumber"/>
-        <w:spacing w:after="120" w:line="264" w:lineRule="auto"/>
-        <w:ind w:left="720" w:hanging="360"/>
         <w:numPr>
           <w:ilvl w:val="0"/>
           <w:numId w:val="11"/>
         </w:numPr>
       </w:pPr>
       <w:r>
-        <w:t>Создать резервную копию тестового PST.</w:t>
+        <w:t>Распаковать весь комплект в отдельную папку.</w:t>
       </w:r>
     </w:p>
     <w:p>
       <w:pPr>
         <w:pStyle w:val="ListNumber"/>
-        <w:spacing w:after="120" w:line="264" w:lineRule="auto"/>
-        <w:ind w:left="720" w:hanging="360"/>
         <w:numPr>
           <w:ilvl w:val="0"/>
           <w:numId w:val="11"/>
         </w:numPr>
       </w:pPr>
       <w:r>
-        <w:t>Разместить оба скрипта на одном тестовом АРМ.</w:t>
+        <w:t>На тестовом АРМ запустить Test-Package.ps1 и убедиться, что получен PACKAGE_TEST=SUCCESS.</w:t>
       </w:r>
     </w:p>
     <w:p>
       <w:pPr>
         <w:pStyle w:val="ListNumber"/>
-        <w:spacing w:after="120" w:line="264" w:lineRule="auto"/>
-        <w:ind w:left="720" w:hanging="360"/>
         <w:numPr>
           <w:ilvl w:val="0"/>
           <w:numId w:val="11"/>
         </w:numPr>
       </w:pPr>
       <w:r>
-        <w:t>Запустить первый этап с указанием тестовой папки назначения.</w:t>
+        <w:t>Запустить Start-Local-SAFE.bat от имени администратора.</w:t>
       </w:r>
     </w:p>
     <w:p>
       <w:pPr>
         <w:pStyle w:val="ListNumber"/>
-        <w:spacing w:after="120" w:line="264" w:lineRule="auto"/>
-        <w:ind w:left="720" w:hanging="360"/>
         <w:numPr>
           <w:ilvl w:val="0"/>
           <w:numId w:val="11"/>
         </w:numPr>
       </w:pPr>
       <w:r>
-        <w:t>Проверить открытие Outlook, наличие архивных папок и доступность писем.</w:t>
+        <w:t>Проверить manifest.csv, открытие новых архивов и доступность писем.</w:t>
       </w:r>
     </w:p>
     <w:p>
       <w:pPr>
         <w:pStyle w:val="ListNumber"/>
-        <w:spacing w:after="120" w:line="264" w:lineRule="auto"/>
-        <w:ind w:left="720" w:hanging="360"/>
         <w:numPr>
           <w:ilvl w:val="0"/>
           <w:numId w:val="11"/>
         </w:numPr>
       </w:pPr>
       <w:r>
-        <w:t>Перезапустить Windows и убедиться, что архив остаётся подключённым.</w:t>
+        <w:t>Перезапустить Outlook и Windows, повторно проверить подключение PST.</w:t>
       </w:r>
     </w:p>
     <w:p>
       <w:pPr>
         <w:pStyle w:val="ListNumber"/>
-        <w:spacing w:after="120" w:line="264" w:lineRule="auto"/>
-        <w:ind w:left="720" w:hanging="360"/>
         <w:numPr>
           <w:ilvl w:val="0"/>
           <w:numId w:val="11"/>
         </w:numPr>
       </w:pPr>
       <w:r>
-        <w:t>Проверить отсутствие исходного PST и наличие проверенной копии в новом расположении.</w:t>
-      </w:r>
-    </w:p>
-    <w:p>
-      <w:pPr>
-        <w:pStyle w:val="ListNumber"/>
-        <w:spacing w:after="120" w:line="264" w:lineRule="auto"/>
-        <w:ind w:left="720" w:hanging="360"/>
-        <w:numPr>
-          <w:ilvl w:val="0"/>
-          <w:numId w:val="11"/>
-        </w:numPr>
-      </w:pPr>
-      <w:r>
-        <w:t>После успешного пилота выполнить ограниченное развёртывание на группе АРМ и только затем массовый запуск.</w:t>
+        <w:t>Провести ограниченный пилот на нескольких АРМ и только затем массовое развёртывание через Start-Migration.bat /silent.</w:t>
       </w:r>
     </w:p>
     <w:p>
       <w:pPr>
         <w:pStyle w:val="Heading1"/>
-        <w:keepNext/>
       </w:pPr>
       <w:r>
-        <w:t>8. Критерии успешного выполнения</w:t>
+        <w:t>7. Критерии успешного выполнения</w:t>
       </w:r>
     </w:p>
     <w:p>
       <w:pPr>
         <w:pStyle w:val="ListBullet"/>
-        <w:spacing w:after="120" w:line="264" w:lineRule="auto"/>
-        <w:ind w:left="720" w:hanging="360"/>
       </w:pPr>
       <w:r>
-        <w:t>Все найденные PST присутствуют в папке назначения.</w:t>
+        <w:t>result.json содержит Status = Success;</w:t>
       </w:r>
     </w:p>
     <w:p>
       <w:pPr>
         <w:pStyle w:val="ListBullet"/>
-        <w:spacing w:after="120" w:line="264" w:lineRule="auto"/>
-        <w:ind w:left="720" w:hanging="360"/>
       </w:pPr>
       <w:r>
-        <w:t>Архивы отображаются в Outlook и письма из них открываются.</w:t>
+        <w:t>в папке назначения присутствуют проверенные копии PST;</w:t>
       </w:r>
     </w:p>
     <w:p>
       <w:pPr>
         <w:pStyle w:val="ListBullet"/>
-        <w:spacing w:after="120" w:line="264" w:lineRule="auto"/>
-        <w:ind w:left="720" w:hanging="360"/>
       </w:pPr>
       <w:r>
-        <w:t>Старые недоступные хранилища не остаются подключёнными.</w:t>
+        <w:t>SourceHash и DestinationHash в manifest.csv совпадают;</w:t>
       </w:r>
     </w:p>
     <w:p>
       <w:pPr>
         <w:pStyle w:val="ListBullet"/>
-        <w:spacing w:after="120" w:line="264" w:lineRule="auto"/>
-        <w:ind w:left="720" w:hanging="360"/>
       </w:pPr>
       <w:r>
-        <w:t>Исходники удалены только для успешно перенесённых архивов.</w:t>
+        <w:t>ранее подключённые PST открываются по новым путям;</w:t>
       </w:r>
     </w:p>
     <w:p>
       <w:pPr>
         <w:pStyle w:val="ListBullet"/>
-        <w:spacing w:after="120" w:line="264" w:lineRule="auto"/>
-        <w:ind w:left="720" w:hanging="360"/>
       </w:pPr>
       <w:r>
-        <w:t>Файлы OST и другие пользовательские документы не изменены.</w:t>
+        <w:t>исходные PST остаются на прежнем месте;</w:t>
       </w:r>
     </w:p>
     <w:p>
       <w:pPr>
         <w:pStyle w:val="ListBullet"/>
-        <w:spacing w:after="120" w:line="264" w:lineRule="auto"/>
-        <w:ind w:left="720" w:hanging="360"/>
       </w:pPr>
       <w:r>
-        <w:t>При ошибке сохранён исходный PST и имеется диагностическое сообщение PowerShell.</w:t>
+        <w:t>в Планировщике не остаётся временное задание миграции.</w:t>
+      </w:r>
+    </w:p>
+    <w:p>
+      <w:pPr>
+        <w:pStyle w:val="Heading1"/>
+      </w:pPr>
+      <w:r>
+        <w:t>8. Вывод</w:t>
+      </w:r>
+    </w:p>
+    <w:p>
+      <w:r>
+        <w:t>SAFE V7 устраняет риски, выявленные аудитом V6: проверка места выполняется до закрытия Outlook, не используется принудительное завершение Outlook, устаревшие lock-файлы не блокируют новый запуск, проверенные копии сохраняются при ошибке, а результат и манифест записываются в контролируемом формате. Перед массовым применением всё равно требуется пилот на реальных корпоративных АРМ.</w:t>
+      </w:r>
+    </w:p>
+    <w:p>
+      <w:pPr>
+        <w:pStyle w:val="Heading1"/>
+      </w:pPr>
+      <w:r>
+        <w:t>Официальная документация</w:t>
       </w:r>
     </w:p>
     <w:p>
       <w:pPr>
         <w:pStyle w:val="ListBullet"/>
-        <w:spacing w:after="120" w:line="264" w:lineRule="auto"/>
-        <w:ind w:left="720" w:hanging="360"/>
       </w:pPr>
       <w:r>
-        <w:t>Созданы migration.log и result.json с итогом обработки.</w:t>
+        <w:t>Microsoft: NameSpace.AddStoreEx — https://learn.microsoft.com/office/vba/api/outlook.namespace.addstoreex</w:t>
       </w:r>
     </w:p>
     <w:p>
       <w:pPr>
-        <w:pStyle w:val="Heading1"/>
-        <w:keepNext/>
+        <w:pStyle w:val="ListBullet"/>
       </w:pPr>
       <w:r>
-        <w:t>9. Вывод</w:t>
+        <w:t>Microsoft: новый Outlook и COM — https://learn.microsoft.com/office/dev/add-ins/outlook/one-outlook</w:t>
       </w:r>
     </w:p>
     <w:p>
+      <w:pPr>
+        <w:pStyle w:val="ListBullet"/>
+      </w:pPr>
       <w:r>
-        <w:t>Предлагаемое решение подходит для контролируемого массового переноса локальных PST-архивов при условии предварительного пилотного тестирования. Двухэтапная схема необходима для корректной работы с пользовательским профилем Outlook и обеспечивает сохранение исходных данных до подтверждения успешного подключения новой копии.</w:t>
+        <w:t>Microsoft PowerShell — https://learn.microsoft.com/powershell/</w:t>
       </w:r>
     </w:p>
     <w:sectPr>
@@ -684,16 +727,16 @@
   <w:p>
     <w:pPr>
       <w:pStyle w:val="Footer"/>
-      <w:jc w:val="right"/>
+      <w:jc w:val="center"/>
     </w:pPr>
     <w:r>
       <w:rPr>
-        <w:color w:val="5A5A5A"/>
+        <w:rFonts w:ascii="Calibri" w:hAnsi="Calibri"/>
+        <w:color w:val="5A626C"/>
         <w:sz w:val="18"/>
       </w:rPr>
-      <w:t xml:space="preserve">Страница </w:t>
+      <w:t>Пилотное тестирование перед массовым развёртыванием</w:t>
     </w:r>
-    <w:fldSimple w:instr="PAGE"/>
   </w:p>
 </w:ftr>
 </file>
@@ -701,13 +744,17 @@
 <file path=word/header1.xml><?xml version="1.0" encoding="utf-8"?>
 <w:hdr xmlns:m="http://schemas.openxmlformats.org/officeDocument/2006/math" xmlns:mc="http://schemas.openxmlformats.org/markup-compatibility/2006" xmlns:mo="http://schemas.microsoft.com/office/mac/office/2008/main" xmlns:mv="urn:schemas-microsoft-com:mac:vml" xmlns:o="urn:schemas-microsoft-com:office:office" xmlns:r="http://schemas.openxmlformats.org/officeDocument/2006/relationships" xmlns:v="urn:schemas-microsoft-com:vml" xmlns:w10="urn:schemas-microsoft-com:office:word" xmlns:w14="http://schemas.microsoft.com/office/word/2010/wordml" xmlns:w="http://schemas.openxmlformats.org/wordprocessingml/2006/main" xmlns:wne="http://schemas.microsoft.com/office/word/2006/wordml" xmlns:wp14="http://schemas.microsoft.com/office/word/2010/wordprocessingDrawing" xmlns:wp="http://schemas.openxmlformats.org/drawingml/2006/wordprocessingDrawing" xmlns:wpc="http://schemas.microsoft.com/office/word/2010/wordprocessingCanvas" xmlns:wpg="http://schemas.microsoft.com/office/word/2010/wordprocessingGroup" xmlns:wpi="http://schemas.microsoft.com/office/word/2010/wordprocessingInk" xmlns:wps="http://schemas.microsoft.com/office/word/2010/wordprocessingShape" mc:Ignorable="w14 wp14">
   <w:p>
-    <w:pPr/>
+    <w:pPr>
+      <w:pStyle w:val="Header"/>
+      <w:jc w:val="right"/>
+    </w:pPr>
     <w:r>
       <w:rPr>
-        <w:color w:val="5A5A5A"/>
+        <w:rFonts w:ascii="Calibri" w:hAnsi="Calibri"/>
+        <w:color w:val="5A626C"/>
         <w:sz w:val="18"/>
       </w:rPr>
-      <w:t>Пояснительная записка | Перенос архивов Outlook</w:t>
+      <w:t>OUTLOOK PST MIGRATION | SAFE V7</w:t>
     </w:r>
   </w:p>
 </w:hdr>
@@ -913,39 +960,17 @@
   <w:num w:numId="9">
     <w:abstractNumId w:val="0"/>
   </w:num>
-  <w:abstractNum w:abstractNumId="9">
-    <w:lvl w:ilvl="0">
-      <w:start w:val="1"/>
-      <w:numFmt w:val="decimal"/>
-      <w:lvlText w:val="%1."/>
-      <w:lvlJc w:val="left"/>
-      <w:pPr>
-        <w:tabs>
-          <w:tab w:val="num" w:pos="720"/>
-        </w:tabs>
-        <w:ind w:left="720" w:hanging="360"/>
-      </w:pPr>
-    </w:lvl>
-  </w:abstractNum>
   <w:num w:numId="10">
-    <w:abstractNumId w:val="9"/>
+    <w:abstractNumId w:val="0"/>
+    <w:lvlOverride w:ilvl="0">
+      <w:startOverride w:val="1"/>
+    </w:lvlOverride>
   </w:num>
-  <w:abstractNum w:abstractNumId="10">
-    <w:lvl w:ilvl="0">
-      <w:start w:val="1"/>
-      <w:numFmt w:val="decimal"/>
-      <w:lvlText w:val="%1."/>
-      <w:lvlJc w:val="left"/>
-      <w:pPr>
-        <w:tabs>
-          <w:tab w:val="num" w:pos="720"/>
-        </w:tabs>
-        <w:ind w:left="720" w:hanging="360"/>
-      </w:pPr>
-    </w:lvl>
-  </w:abstractNum>
   <w:num w:numId="11">
-    <w:abstractNumId w:val="10"/>
+    <w:abstractNumId w:val="0"/>
+    <w:lvlOverride w:ilvl="0">
+      <w:startOverride w:val="1"/>
+    </w:lvlOverride>
   </w:num>
 </w:numbering>
 </file>
@@ -1645,8 +1670,14 @@
       <w:numPr>
         <w:numId w:val="1"/>
       </w:numPr>
+      <w:spacing w:after="120" w:line="264" w:lineRule="auto"/>
+      <w:ind w:left="720" w:hanging="360"/>
       <w:contextualSpacing/>
     </w:pPr>
+    <w:rPr>
+      <w:rFonts w:ascii="Calibri" w:hAnsi="Calibri"/>
+      <w:sz w:val="22"/>
+    </w:rPr>
   </w:style>
   <w:style w:type="paragraph" w:styleId="ListBullet2">
     <w:name w:val="List Bullet 2"/>
@@ -1684,8 +1715,14 @@
       <w:numPr>
         <w:numId w:val="5"/>
       </w:numPr>
+      <w:spacing w:after="120" w:line="264" w:lineRule="auto"/>
+      <w:ind w:left="720" w:hanging="360"/>
       <w:contextualSpacing/>
     </w:pPr>
+    <w:rPr>
+      <w:rFonts w:ascii="Calibri" w:hAnsi="Calibri"/>
+      <w:sz w:val="22"/>
+    </w:rPr>
   </w:style>
   <w:style w:type="paragraph" w:styleId="ListNumber2">
     <w:name w:val="List Number 2"/>

</xml_diff>

<commit_message>
Release transactional SAFE V8 core
</commit_message>
<xml_diff>
--- a/Пояснительная_записка_перенос_PST_Outlook.docx
+++ b/Пояснительная_записка_перенос_PST_Outlook.docx
@@ -80,7 +80,7 @@
                 <w:rFonts w:ascii="Calibri" w:hAnsi="Calibri"/>
                 <w:sz w:val="21"/>
               </w:rPr>
-              <w:t>Outlook PST Migration SAFE V7</w:t>
+              <w:t>Outlook PST Migration SAFE V8</w:t>
             </w:r>
           </w:p>
         </w:tc>
@@ -356,7 +356,19 @@
         </w:numPr>
       </w:pPr>
       <w:r>
-        <w:t>PST копируются во временные файлы .partial, затем исходник и копия проверяются по SHA-256.</w:t>
+        <w:t>Перед изменением Outlook в state.json сохраняется восстанавливаемый план для каждого PST.</w:t>
+      </w:r>
+    </w:p>
+    <w:p>
+      <w:pPr>
+        <w:pStyle w:val="ListNumber"/>
+        <w:numPr>
+          <w:ilvl w:val="0"/>
+          <w:numId w:val="10"/>
+        </w:numPr>
+      </w:pPr>
+      <w:r>
+        <w:t>PST копируются во временные файлы .partial; SHA-256 исходника считается в процессе копирования, а копия проверяется отдельным чтением.</w:t>
       </w:r>
     </w:p>
     <w:p>
@@ -376,7 +388,7 @@
         <w:pStyle w:val="Heading1"/>
       </w:pPr>
       <w:r>
-        <w:t>3. Меры безопасности V7</w:t>
+        <w:t>3. Меры безопасности V8</w:t>
       </w:r>
     </w:p>
     <w:p>
@@ -424,6 +436,22 @@
         <w:pStyle w:val="ListBullet"/>
       </w:pPr>
       <w:r>
+        <w:t>state.json атомарно фиксирует этапы Planned, Copying, Verified, Attached и Completed; повторный запуск использует сохранённый план.</w:t>
+      </w:r>
+    </w:p>
+    <w:p>
+      <w:pPr>
+        <w:pStyle w:val="ListBullet"/>
+      </w:pPr>
+      <w:r>
+        <w:t>Временные ошибки копирования повторяются до трёх раз с увеличивающейся задержкой.</w:t>
+      </w:r>
+    </w:p>
+    <w:p>
+      <w:pPr>
+        <w:pStyle w:val="ListBullet"/>
+      </w:pPr>
+      <w:r>
         <w:t>При изменении профиля Outlook выполняется откат подключений.</w:t>
       </w:r>
     </w:p>
@@ -454,7 +482,7 @@
           <w:rFonts w:ascii="Consolas" w:hAnsi="Consolas"/>
           <w:sz w:val="20"/>
         </w:rPr>
-        <w:t>C:\ProgramData\OutlookPstMigrationSafeV7\&lt;SID&gt;</w:t>
+        <w:t>C:\ProgramData\OutlookPstMigrationSafeV8\&lt;SID&gt;</w:t>
       </w:r>
     </w:p>
     <w:p>
@@ -470,7 +498,15 @@
         <w:pStyle w:val="ListBullet"/>
       </w:pPr>
       <w:r>
-        <w:t>result.json — состояние, количество PST, объём и пути журналов;</w:t>
+        <w:t>result.json — краткий итог выполнения;</w:t>
+      </w:r>
+    </w:p>
+    <w:p>
+      <w:pPr>
+        <w:pStyle w:val="ListBullet"/>
+      </w:pPr>
+      <w:r>
+        <w:t>state.json — этапы каждого PST и данные для продолжения;</w:t>
       </w:r>
     </w:p>
     <w:p>
@@ -519,6 +555,14 @@
       </w:pPr>
       <w:r>
         <w:t>Неподключённые PST вне профиля пользователя намеренно не ищутся, чтобы не захватить данные другого сотрудника.</w:t>
+      </w:r>
+    </w:p>
+    <w:p>
+      <w:pPr>
+        <w:pStyle w:val="ListBullet"/>
+      </w:pPr>
+      <w:r>
+        <w:t>На терминальном сервере автоматически выбирается только активный консольный пользователь; массовую обработку нескольких сеансов следует выполнять отдельно.</w:t>
       </w:r>
     </w:p>
     <w:p>
@@ -638,7 +682,15 @@
         <w:pStyle w:val="ListBullet"/>
       </w:pPr>
       <w:r>
-        <w:t>SourceHash и DestinationHash в manifest.csv совпадают;</w:t>
+        <w:t>SHA-256 исходника и копии в manifest.csv совпадают;</w:t>
+      </w:r>
+    </w:p>
+    <w:p>
+      <w:pPr>
+        <w:pStyle w:val="ListBullet"/>
+      </w:pPr>
+      <w:r>
+        <w:t>state.json содержит OverallState = Completed;</w:t>
       </w:r>
     </w:p>
     <w:p>
@@ -675,7 +727,7 @@
     </w:p>
     <w:p>
       <w:r>
-        <w:t>SAFE V7 устраняет риски, выявленные аудитом V6: проверка места выполняется до закрытия Outlook, не используется принудительное завершение Outlook, устаревшие lock-файлы не блокируют новый запуск, проверенные копии сохраняются при ошибке, а результат и манифест записываются в контролируемом формате. Перед массовым применением всё равно требуется пилот на реальных корпоративных АРМ.</w:t>
+        <w:t>SAFE V8 развивает безопасное ядро V7: операция стала транзакционной и восстанавливаемой, состояние каждого PST сохраняется после критических этапов, исходник хешируется одновременно с копированием, записанная копия проверяется независимым чтением, а временные ошибки копирования автоматически повторяются. Перед массовым применением всё равно требуется пилот на реальных корпоративных АРМ.</w:t>
       </w:r>
     </w:p>
     <w:p>
@@ -754,7 +806,7 @@
         <w:color w:val="5A626C"/>
         <w:sz w:val="18"/>
       </w:rPr>
-      <w:t>OUTLOOK PST MIGRATION | SAFE V7</w:t>
+      <w:t>OUTLOOK PST MIGRATION | SAFE V8</w:t>
     </w:r>
   </w:p>
 </w:hdr>

</xml_diff>